<commit_message>
Implement footer functionality and enhance document generation features
- Added support for customizable footers in .docx documents, including page numbering and templates for footer text.
- Introduced methods to set footer page number and template, allowing for dynamic footer content.
- Enhanced document saving functionality to include footer references in the document structure.
- Added tests to validate footer functionality and ensure correct rendering in generated documents.
- Improved error handling for footer-related operations, ensuring robust document generation.
</commit_message>
<xml_diff>
--- a/laporan.docx
+++ b/laporan.docx
@@ -13,7 +13,12 @@
     </w:p>
     <w:p>
       <w:r>
-        <w:t xml:space="preserve">Paragraf setelah judul — style Heading1 terdaftar sebagai: heading 1</w:t>
+        <w:t xml:space="preserve">Catatan: footer kanan memakai template No. + PAGE + NUMPAGES. Setelah pemecah halaman, Word memperbarui nomor per halaman.</w:t>
+      </w:r>
+    </w:p>
+    <w:p>
+      <w:r>
+        <w:t xml:space="preserve">Style Heading1 terdaftar sebagai: heading 1</w:t>
       </w:r>
     </w:p>
     <w:p>
@@ -22,12 +27,12 @@
         <w:spacing w:after="240"/>
       </w:pPr>
       <w:r>
-        <w:t xml:space="preserve">Paragraf dengan indent kiri dan baris pertama (w:ind), plus jarak setelah paragraf (w:spacing). Silahkan lihat di atas. Contoh paragraf ini. Paragraf ini juga memakai style Heading1. lorem ipsum dolor sit amet, consectetur adipiscing elit. Sed do eiusmod tempor incididunt ut labore et dolore magna aliqua. Ut enim ad minim veniam, quis nostrud exercitation ullamco laboris nisi ut aliquip ex ea commodo consequat. Duis aute irure dolor in reprehenderit in voluptate velit esse cillum dolore eu fugiat nulla pariatur. Excepteur sint occaecat cupidatat non proident, sunt in culpa qui officia deserunt mollit anim id est laborum.</w:t>
-      </w:r>
-    </w:p>
-    <w:p>
-      <w:r>
-        <w:t xml:space="preserve">[Kiri] Teks ini rata kiri (default).</w:t>
+        <w:t xml:space="preserve">Paragraf dengan indent kiri + baris pertama (w:ind) dan jarak setelah paragraf (w:spacing). Lorem ipsum dolor sit amet, consectetur adipiscing elit.</w:t>
+      </w:r>
+    </w:p>
+    <w:p>
+      <w:r>
+        <w:t xml:space="preserve">[Kiri] Teks rata kiri (default).</w:t>
       </w:r>
     </w:p>
     <w:p>
@@ -51,12 +56,12 @@
         <w:jc w:val="both"/>
       </w:pPr>
       <w:r>
-        <w:t xml:space="preserve">[Rata kiri-kanan] Paragraf panjang supaya justify terlihat: Lorem ipsum dolor sit amet, consectetur adipiscing elit. Integer vitae velit non ligula faucibus auctor. Donec vitae sapien ut libero venenatis faucibus. Nullam quis ante etiam sit amet orci eget eros faucibus tincidunt.</w:t>
-      </w:r>
-    </w:p>
-    <w:p>
-      <w:r>
-        <w:t xml:space="preserve">Teks di halaman pertama (di bawah ini pemecah halaman).</w:t>
+        <w:t xml:space="preserve">[Justify] Paragraf panjang: Lorem ipsum dolor sit amet, consectetur adipiscing elit. Integer vitae velit non ligula faucibus auctor. Donec vitae sapien ut libero venenatis faucibus.</w:t>
+      </w:r>
+    </w:p>
+    <w:p>
+      <w:r>
+        <w:t xml:space="preserve">Halaman 1 — di bawah ini page break.</w:t>
       </w:r>
       <w:r>
         <w:br w:type="page"/>
@@ -64,7 +69,7 @@
     </w:p>
     <w:p>
       <w:r>
-        <w:t xml:space="preserve">Teks ini dimulai di halaman baru (lihat di Word: tampilan halaman / cetak).</w:t>
+        <w:t xml:space="preserve">Halaman 2 — cek footer menampilkan nomor 2.</w:t>
       </w:r>
     </w:p>
     <w:p>
@@ -154,10 +159,7 @@
         <w:t xml:space="preserve">2</w:t>
       </w:r>
       <w:r>
-        <w:t xml:space="preserve">O</w:t>
-      </w:r>
-      <w:r>
-        <w:t xml:space="preserve">.</w:t>
+        <w:t xml:space="preserve">O.</w:t>
       </w:r>
     </w:p>
     <w:p>
@@ -232,7 +234,7 @@
     </w:p>
     <w:p>
       <w:r>
-        <w:t xml:space="preserve">Tabel ringkas (border + isi sel):</w:t>
+        <w:t xml:space="preserve">Tabel (border + isi sel):</w:t>
       </w:r>
     </w:p>
     <w:tbl>
@@ -338,7 +340,7 @@
           </w:tcPr>
           <w:p>
             <w:r>
-              <w:t xml:space="preserve">Gabungan teks panjang di satu sel untuk uji wrap.</w:t>
+              <w:t xml:space="preserve">Teks panjang di satu sel (uji wrap).</w:t>
             </w:r>
           </w:p>
         </w:tc>
@@ -371,26 +373,94 @@
         </w:sectPr>
       </w:pPr>
       <w:r>
-        <w:t xml:space="preserve">Di bawah ini pemecah bagian: isi berikutnya memakai orientasi lanskap (cek Layout di Word).</w:t>
-      </w:r>
-    </w:p>
-    <w:p>
-      <w:r>
-        <w:t xml:space="preserve">Teks di section kedua (landskap). Sesuaikan dengan d.SectionAt(i).SetOrientation(...) per indeks Sections().</w:t>
-      </w:r>
-    </w:p>
-    <w:p>
-      <w:r>
-        <w:t xml:space="preserve">Akhir contoh — buka file di Word/LibreOffice untuk memeriksa tampilan.</w:t>
+        <w:t xml:space="preserve">Pemecah bagian berikut: section berikutnya lanskap.</w:t>
+      </w:r>
+    </w:p>
+    <w:p>
+      <w:r>
+        <w:t xml:space="preserve">Isi di section lanskap. Atur lewat d.SectionAt(i) sesuai indeks bagian.</w:t>
+      </w:r>
+    </w:p>
+    <w:p>
+      <w:pPr>
+        <w:sectPr xmlns:w="http://schemas.openxmlformats.org/wordprocessingml/2006/main">
+          <w:type w:val="continuous"/>
+          <w:pgSz w:w="11906" w:h="16838" w:orient="portrait"/>
+          <w:pgMar w:top="0" w:right="0" w:bottom="0" w:left="0" w:header="0" w:footer="0" w:gutter="0"/>
+          <w:cols w:num="1" w:sep="0" w:equalWidth="0"/>
+        </w:sectPr>
+      </w:pPr>
+      <w:r>
+        <w:t xml:space="preserve">Pemecah bagian continuous: orientasi portrait lagi (tanpa halaman baru wajib).</w:t>
+      </w:r>
+    </w:p>
+    <w:p>
+      <w:r>
+        <w:t xml:space="preserve">Isi setelah section portrait (continuous).</w:t>
+      </w:r>
+    </w:p>
+    <w:p>
+      <w:r>
+        <w:t xml:space="preserve">Akhir contoh — buka di Word/LibreOffice untuk memeriksa tampilan.</w:t>
       </w:r>
     </w:p>
     <w:sectPr xmlns:w="http://schemas.openxmlformats.org/wordprocessingml/2006/main">
       <w:pgSz w:w="11906" w:h="16838" w:orient="portrait"/>
       <w:pgMar w:top="1800" w:right="1440" w:bottom="1800" w:left="1440" w:header="720" w:footer="720" w:gutter="0"/>
       <w:cols w:num="1" w:sep="0" w:equalWidth="0"/>
+      <w:footerReference w:type="default" r:id="rId3"/>
     </w:sectPr>
   </w:body>
 </w:document>
+</file>
+
+<file path=word/footer1.xml><?xml version="1.0" encoding="utf-8"?>
+<w:ftr xmlns:w="http://schemas.openxmlformats.org/wordprocessingml/2006/main" xmlns:r="http://schemas.openxmlformats.org/officeDocument/2006/relationships">
+  <w:p>
+    <w:pPr>
+      <w:jc w:val="right"/>
+    </w:pPr>
+    <w:r>
+      <w:t xml:space="preserve">No. </w:t>
+    </w:r>
+    <w:r>
+      <w:fldChar w:fldCharType="begin"/>
+    </w:r>
+    <w:r>
+      <w:instrText xml:space="preserve"> PAGE </w:instrText>
+    </w:r>
+    <w:r>
+      <w:fldChar w:fldCharType="separate"/>
+    </w:r>
+    <w:r>
+      <w:t>1</w:t>
+    </w:r>
+    <w:r>
+      <w:fldChar w:fldCharType="end"/>
+    </w:r>
+    <w:r>
+      <w:t xml:space="preserve"> / </w:t>
+    </w:r>
+    <w:r>
+      <w:fldChar w:fldCharType="begin"/>
+    </w:r>
+    <w:r>
+      <w:instrText xml:space="preserve"> NUMPAGES </w:instrText>
+    </w:r>
+    <w:r>
+      <w:fldChar w:fldCharType="separate"/>
+    </w:r>
+    <w:r>
+      <w:t>1</w:t>
+    </w:r>
+    <w:r>
+      <w:fldChar w:fldCharType="end"/>
+    </w:r>
+    <w:r>
+      <w:t xml:space="preserve"> hal.</w:t>
+    </w:r>
+  </w:p>
+</w:ftr>
 </file>
 
 <file path=word/numbering.xml><?xml version="1.0" encoding="utf-8"?>

</xml_diff>

<commit_message>
Enhance document generation with header and pagination features
- Introduced support for customizable headers in .docx documents, including page numbering and templates for header text.
- Implemented pagination features, allowing for control over page breaks, keep next, and keep lines properties in paragraphs.
- Enhanced table row properties to support header rows and prevent row splitting across pages.
- Updated document saving functionality to include header references and improved layout handling.
- Added tests to validate header and pagination functionalities, ensuring correct rendering in generated documents.
</commit_message>
<xml_diff>
--- a/laporan.docx
+++ b/laporan.docx
@@ -3,22 +3,256 @@
 <w:document xmlns:w="http://schemas.openxmlformats.org/wordprocessingml/2006/main" xmlns:r="http://schemas.openxmlformats.org/officeDocument/2006/relationships">
   <w:body>
     <w:p>
-      <w:r>
-        <w:rPr>
-          <w:b/>
-          <w:sz w:val="36"/>
-        </w:rPr>
-        <w:t xml:space="preserve">Contoh Office (DOCX)</w:t>
-      </w:r>
-    </w:p>
-    <w:p>
-      <w:r>
-        <w:t xml:space="preserve">Catatan: footer kanan memakai template No. + PAGE + NUMPAGES. Setelah pemecah halaman, Word memperbarui nomor per halaman.</w:t>
-      </w:r>
-    </w:p>
-    <w:p>
-      <w:r>
-        <w:t xml:space="preserve">Style Heading1 terdaftar sebagai: heading 1</w:t>
+      <w:pPr>
+        <w:jc w:val="center"/>
+        <w:spacing w:after="360"/>
+      </w:pPr>
+      <w:r>
+        <w:rPr>
+          <w:b/>
+          <w:sz w:val="56"/>
+        </w:rPr>
+        <w:t xml:space="preserve">LAPORAN CONTOH</w:t>
+      </w:r>
+    </w:p>
+    <w:p>
+      <w:pPr>
+        <w:jc w:val="center"/>
+        <w:spacing w:after="720"/>
+      </w:pPr>
+      <w:r>
+        <w:rPr>
+          <w:sz w:val="28"/>
+        </w:rPr>
+        <w:t xml:space="preserve">Paket github.com/triadmoko/office/docx</w:t>
+      </w:r>
+    </w:p>
+    <w:p>
+      <w:pPr>
+        <w:jc w:val="center"/>
+      </w:pPr>
+      <w:r>
+        <w:t xml:space="preserve"> </w:t>
+      </w:r>
+    </w:p>
+    <w:p>
+      <w:pPr>
+        <w:jc w:val="center"/>
+      </w:pPr>
+      <w:r>
+        <w:t xml:space="preserve"> </w:t>
+      </w:r>
+    </w:p>
+    <w:p>
+      <w:pPr>
+        <w:jc w:val="center"/>
+      </w:pPr>
+      <w:r>
+        <w:t xml:space="preserve"> </w:t>
+      </w:r>
+    </w:p>
+    <w:p>
+      <w:pPr>
+        <w:jc w:val="center"/>
+      </w:pPr>
+      <w:r>
+        <w:t xml:space="preserve"> </w:t>
+      </w:r>
+    </w:p>
+    <w:p>
+      <w:pPr>
+        <w:jc w:val="center"/>
+      </w:pPr>
+      <w:r>
+        <w:t xml:space="preserve"> </w:t>
+      </w:r>
+    </w:p>
+    <w:p>
+      <w:pPr>
+        <w:jc w:val="center"/>
+      </w:pPr>
+      <w:r>
+        <w:t xml:space="preserve"> </w:t>
+      </w:r>
+    </w:p>
+    <w:p>
+      <w:pPr>
+        <w:jc w:val="center"/>
+      </w:pPr>
+      <w:r>
+        <w:t xml:space="preserve"> </w:t>
+      </w:r>
+    </w:p>
+    <w:p>
+      <w:pPr>
+        <w:jc w:val="center"/>
+      </w:pPr>
+      <w:r>
+        <w:t xml:space="preserve"> </w:t>
+      </w:r>
+    </w:p>
+    <w:p>
+      <w:pPr>
+        <w:jc w:val="center"/>
+      </w:pPr>
+      <w:r>
+        <w:t xml:space="preserve">Disusun untuk demonstrasi API</w:t>
+      </w:r>
+    </w:p>
+    <w:p>
+      <w:pPr>
+        <w:jc w:val="center"/>
+      </w:pPr>
+      <w:r>
+        <w:t xml:space="preserve">Setelah TOC: SetSectionBreak(nextPage) memisahkan bagian depan dan isi utama.</w:t>
+      </w:r>
+    </w:p>
+    <w:p>
+      <w:pPr>
+        <w:jc w:val="center"/>
+      </w:pPr>
+      <w:r>
+        <w:t xml:space="preserve">Halaman berikutnya: daftar isi.</w:t>
+      </w:r>
+      <w:r>
+        <w:br w:type="page"/>
+      </w:r>
+    </w:p>
+    <w:p>
+      <w:pPr>
+        <w:spacing w:after="240"/>
+      </w:pPr>
+      <w:r>
+        <w:rPr>
+          <w:b/>
+          <w:sz w:val="32"/>
+        </w:rPr>
+        <w:t xml:space="preserve">Daftar isi</w:t>
+      </w:r>
+    </w:p>
+    <w:p>
+      <w:pPr>
+        <w:spacing w:after="180"/>
+      </w:pPr>
+      <w:r>
+        <w:t xml:space="preserve">Entri manual (titik). TOC otomatis Word = Tier 3.</w:t>
+      </w:r>
+    </w:p>
+    <w:p>
+      <w:pPr>
+        <w:spacing w:after="120"/>
+      </w:pPr>
+      <w:r>
+        <w:rPr>
+          <w:sz w:val="22"/>
+        </w:rPr>
+        <w:t xml:space="preserve">1. Pendahuluan ............................................... 3</w:t>
+      </w:r>
+    </w:p>
+    <w:p>
+      <w:pPr>
+        <w:spacing w:after="120"/>
+      </w:pPr>
+      <w:r>
+        <w:rPr>
+          <w:sz w:val="22"/>
+        </w:rPr>
+        <w:t xml:space="preserve">2. Format paragraf &amp; perataan ................................ 3</w:t>
+      </w:r>
+    </w:p>
+    <w:p>
+      <w:pPr>
+        <w:spacing w:after="120"/>
+      </w:pPr>
+      <w:r>
+        <w:rPr>
+          <w:sz w:val="22"/>
+        </w:rPr>
+        <w:t xml:space="preserve">3. Format run (tebal, warna, …) ............................ 4</w:t>
+      </w:r>
+    </w:p>
+    <w:p>
+      <w:pPr>
+        <w:spacing w:after="120"/>
+      </w:pPr>
+      <w:r>
+        <w:rPr>
+          <w:sz w:val="22"/>
+        </w:rPr>
+        <w:t xml:space="preserve">4. Daftar .................................................... 4</w:t>
+      </w:r>
+    </w:p>
+    <w:p>
+      <w:pPr>
+        <w:spacing w:after="120"/>
+      </w:pPr>
+      <w:r>
+        <w:rPr>
+          <w:sz w:val="22"/>
+        </w:rPr>
+        <w:t xml:space="preserve">5. Tabel ..................................................... 4</w:t>
+      </w:r>
+    </w:p>
+    <w:p>
+      <w:pPr>
+        <w:spacing w:after="120"/>
+      </w:pPr>
+      <w:r>
+        <w:rPr>
+          <w:sz w:val="22"/>
+        </w:rPr>
+        <w:t xml:space="preserve">6. Pagination &amp; pemisah OOXML ................................ 6</w:t>
+      </w:r>
+    </w:p>
+    <w:p>
+      <w:pPr>
+        <w:spacing w:before="240" w:after="120"/>
+        <w:sectPr xmlns:w="http://schemas.openxmlformats.org/wordprocessingml/2006/main">
+          <w:type w:val="nextPage"/>
+          <w:pgSz w:w="11906" w:h="16838" w:orient="portrait"/>
+          <w:pgMar w:top="0" w:right="0" w:bottom="0" w:left="0" w:header="0" w:footer="0" w:gutter="0"/>
+          <w:cols w:num="1" w:sep="0" w:equalWidth="0"/>
+        </w:sectPr>
+      </w:pPr>
+      <w:r>
+        <w:t xml:space="preserve">Di bawah ini w:sectPr + w:type nextPage: section baru dimulai setelah paragraf ini (biasanya halaman baru).</w:t>
+      </w:r>
+    </w:p>
+    <w:p>
+      <w:pPr>
+        <w:spacing w:before="120" w:after="200"/>
+      </w:pPr>
+      <w:r>
+        <w:rPr>
+          <w:b/>
+          <w:sz w:val="28"/>
+        </w:rPr>
+        <w:t xml:space="preserve">1. Pendahuluan</w:t>
+      </w:r>
+    </w:p>
+    <w:p>
+      <w:pPr>
+        <w:spacing w:after="200"/>
+      </w:pPr>
+      <w:r>
+        <w:t xml:space="preserve">Ini isi utama setelah section break. Di bawah: demo paragraf, run, daftar, tabel.</w:t>
+      </w:r>
+    </w:p>
+    <w:p>
+      <w:r>
+        <w:t xml:space="preserve">Heading1 terdaftar sebagai: heading 1</w:t>
+      </w:r>
+    </w:p>
+    <w:p>
+      <w:pPr>
+        <w:spacing w:before="240" w:after="160"/>
+      </w:pPr>
+      <w:r>
+        <w:rPr>
+          <w:b/>
+          <w:sz w:val="28"/>
+        </w:rPr>
+        <w:t xml:space="preserve">2. Format paragraf</w:t>
       </w:r>
     </w:p>
     <w:p>
@@ -27,20 +261,20 @@
         <w:spacing w:after="240"/>
       </w:pPr>
       <w:r>
-        <w:t xml:space="preserve">Paragraf dengan indent kiri + baris pertama (w:ind) dan jarak setelah paragraf (w:spacing). Lorem ipsum dolor sit amet, consectetur adipiscing elit.</w:t>
-      </w:r>
-    </w:p>
-    <w:p>
-      <w:r>
-        <w:t xml:space="preserve">[Kiri] Teks rata kiri (default).</w:t>
-      </w:r>
-    </w:p>
-    <w:p>
-      <w:pPr>
-        <w:jc w:val="center"/>
-      </w:pPr>
-      <w:r>
-        <w:t xml:space="preserve">[Tengah] Judul atau baris singkat di tengah.</w:t>
+        <w:t xml:space="preserve">Indent + jarak setelah paragraf. Lorem ipsum dolor sit amet.</w:t>
+      </w:r>
+    </w:p>
+    <w:p>
+      <w:r>
+        <w:t xml:space="preserve">[Kiri] Teks rata kiri.</w:t>
+      </w:r>
+    </w:p>
+    <w:p>
+      <w:pPr>
+        <w:jc w:val="center"/>
+      </w:pPr>
+      <w:r>
+        <w:t xml:space="preserve">[Tengah] Judul singkat.</w:t>
       </w:r>
     </w:p>
     <w:p>
@@ -48,7 +282,7 @@
         <w:jc w:val="right"/>
       </w:pPr>
       <w:r>
-        <w:t xml:space="preserve">[Kanan] Catatan atau tanggal di kanan.</w:t>
+        <w:t xml:space="preserve">[Kanan] Catatan di kanan.</w:t>
       </w:r>
     </w:p>
     <w:p>
@@ -56,20 +290,30 @@
         <w:jc w:val="both"/>
       </w:pPr>
       <w:r>
-        <w:t xml:space="preserve">[Justify] Paragraf panjang: Lorem ipsum dolor sit amet, consectetur adipiscing elit. Integer vitae velit non ligula faucibus auctor. Donec vitae sapien ut libero venenatis faucibus.</w:t>
-      </w:r>
-    </w:p>
-    <w:p>
-      <w:r>
-        <w:t xml:space="preserve">Halaman 1 — di bawah ini page break.</w:t>
+        <w:t xml:space="preserve">[Justify] Paragraf panjang: Lorem ipsum dolor sit amet, consectetur adipiscing elit.</w:t>
+      </w:r>
+    </w:p>
+    <w:p>
+      <w:pPr>
+        <w:spacing w:before="120" w:after="120"/>
+      </w:pPr>
+      <w:r>
+        <w:t xml:space="preserve">Page break berikutnya untuk demo run.</w:t>
       </w:r>
       <w:r>
         <w:br w:type="page"/>
       </w:r>
     </w:p>
     <w:p>
-      <w:r>
-        <w:t xml:space="preserve">Halaman 2 — cek footer menampilkan nomor 2.</w:t>
+      <w:pPr>
+        <w:spacing w:after="160"/>
+      </w:pPr>
+      <w:r>
+        <w:rPr>
+          <w:b/>
+          <w:sz w:val="28"/>
+        </w:rPr>
+        <w:t xml:space="preserve">3. Format run</w:t>
       </w:r>
     </w:p>
     <w:p>
@@ -135,13 +379,10 @@
         <w:rPr>
           <w:em w:val="dot"/>
         </w:rPr>
-        <w:t xml:space="preserve">Hellow selamat siang</w:t>
-      </w:r>
-      <w:r>
-        <w:t xml:space="preserve">, </w:t>
-      </w:r>
-      <w:r>
-        <w:t xml:space="preserve">x</w:t>
+        <w:t xml:space="preserve">emphasis dot</w:t>
+      </w:r>
+      <w:r>
+        <w:t xml:space="preserve">, x</w:t>
       </w:r>
       <w:r>
         <w:rPr>
@@ -163,8 +404,20 @@
       </w:r>
     </w:p>
     <w:p>
-      <w:r>
-        <w:t xml:space="preserve">Daftar bullet:</w:t>
+      <w:pPr>
+        <w:spacing w:before="240" w:after="160"/>
+      </w:pPr>
+      <w:r>
+        <w:rPr>
+          <w:b/>
+          <w:sz w:val="28"/>
+        </w:rPr>
+        <w:t xml:space="preserve">4. Daftar</w:t>
+      </w:r>
+    </w:p>
+    <w:p>
+      <w:r>
+        <w:t xml:space="preserve">Bullet:</w:t>
       </w:r>
     </w:p>
     <w:p>
@@ -205,7 +458,7 @@
     </w:p>
     <w:p>
       <w:r>
-        <w:t xml:space="preserve">Daftar bernomor:</w:t>
+        <w:t xml:space="preserve">Bernomor:</w:t>
       </w:r>
     </w:p>
     <w:p>
@@ -233,8 +486,20 @@
       </w:r>
     </w:p>
     <w:p>
-      <w:r>
-        <w:t xml:space="preserve">Tabel (border + isi sel):</w:t>
+      <w:pPr>
+        <w:spacing w:before="240" w:after="160"/>
+      </w:pPr>
+      <w:r>
+        <w:rPr>
+          <w:b/>
+          <w:sz w:val="28"/>
+        </w:rPr>
+        <w:t xml:space="preserve">5. Tabel</w:t>
+      </w:r>
+    </w:p>
+    <w:p>
+      <w:r>
+        <w:t xml:space="preserve">Tabel dengan border:</w:t>
       </w:r>
     </w:p>
     <w:tbl>
@@ -248,6 +513,7 @@
       <w:tr>
         <w:trPr>
           <w:trHeight w:val="500" w:hRule="atLeast"/>
+          <w:tblHeader/>
         </w:trPr>
         <w:tc>
           <w:tcPr>
@@ -291,6 +557,9 @@
         </w:tc>
       </w:tr>
       <w:tr>
+        <w:trPr>
+          <w:cantSplit/>
+        </w:trPr>
         <w:tc>
           <w:tcPr>
             <w:tcBorders>
@@ -304,7 +573,7 @@
           </w:tcPr>
           <w:p>
             <w:r>
-              <w:t xml:space="preserve">Sel baris 2, kolom 1</w:t>
+              <w:t xml:space="preserve">Sel 2,1</w:t>
             </w:r>
           </w:p>
         </w:tc>
@@ -321,7 +590,7 @@
           </w:tcPr>
           <w:p>
             <w:r>
-              <w:t xml:space="preserve">Sel baris 2, kolom 2</w:t>
+              <w:t xml:space="preserve">Sel 2,2</w:t>
             </w:r>
           </w:p>
         </w:tc>
@@ -340,7 +609,7 @@
           </w:tcPr>
           <w:p>
             <w:r>
-              <w:t xml:space="preserve">Teks panjang di satu sel (uji wrap).</w:t>
+              <w:t xml:space="preserve">Teks panjang (wrap).</w:t>
             </w:r>
           </w:p>
         </w:tc>
@@ -365,49 +634,95 @@
     </w:tbl>
     <w:p>
       <w:pPr>
-        <w:sectPr xmlns:w="http://schemas.openxmlformats.org/wordprocessingml/2006/main">
-          <w:type w:val="nextPage"/>
-          <w:pgSz w:w="16838" w:h="11906" w:orient="landscape"/>
-          <w:pgMar w:top="0" w:right="0" w:bottom="0" w:left="0" w:header="0" w:footer="0" w:gutter="0"/>
-          <w:cols w:num="1" w:sep="0" w:equalWidth="0"/>
-        </w:sectPr>
-      </w:pPr>
-      <w:r>
-        <w:t xml:space="preserve">Pemecah bagian berikut: section berikutnya lanskap.</w:t>
-      </w:r>
-    </w:p>
-    <w:p>
-      <w:r>
-        <w:t xml:space="preserve">Isi di section lanskap. Atur lewat d.SectionAt(i) sesuai indeks bagian.</w:t>
-      </w:r>
-    </w:p>
-    <w:p>
-      <w:pPr>
-        <w:sectPr xmlns:w="http://schemas.openxmlformats.org/wordprocessingml/2006/main">
-          <w:type w:val="continuous"/>
-          <w:pgSz w:w="11906" w:h="16838" w:orient="portrait"/>
-          <w:pgMar w:top="0" w:right="0" w:bottom="0" w:left="0" w:header="0" w:footer="0" w:gutter="0"/>
-          <w:cols w:num="1" w:sep="0" w:equalWidth="0"/>
-        </w:sectPr>
-      </w:pPr>
-      <w:r>
-        <w:t xml:space="preserve">Pemecah bagian continuous: orientasi portrait lagi (tanpa halaman baru wajib).</w:t>
-      </w:r>
-    </w:p>
-    <w:p>
-      <w:r>
-        <w:t xml:space="preserve">Isi setelah section portrait (continuous).</w:t>
-      </w:r>
-    </w:p>
-    <w:p>
-      <w:r>
-        <w:t xml:space="preserve">Akhir contoh — buka di Word/LibreOffice untuk memeriksa tampilan.</w:t>
+        <w:spacing w:before="240" w:after="160"/>
+      </w:pPr>
+      <w:r>
+        <w:rPr>
+          <w:b/>
+          <w:sz w:val="28"/>
+        </w:rPr>
+        <w:t xml:space="preserve">6. Pagination &amp; pemisah OOXML</w:t>
+      </w:r>
+    </w:p>
+    <w:p>
+      <w:r>
+        <w:t xml:space="preserve">Paragraf berikut memakai keepNext: paragraf ini tetap bersama paragraf berikutnya di halaman yang sama bila memungkinkan.</w:t>
+      </w:r>
+    </w:p>
+    <w:p>
+      <w:pPr>
+        <w:spacing w:after="60"/>
+        <w:keepNext/>
+      </w:pPr>
+      <w:r>
+        <w:t xml:space="preserve">[keepNext] Judul kecil yang dijaga bersama blok berikut.</w:t>
+      </w:r>
+    </w:p>
+    <w:p>
+      <w:pPr>
+        <w:spacing w:after="200"/>
+      </w:pPr>
+      <w:r>
+        <w:t xml:space="preserve">[ikut keepNext] Blok narasi yang ingin tidak terpisah halaman dari paragraf di atas.</w:t>
+      </w:r>
+    </w:p>
+    <w:p>
+      <w:pPr>
+        <w:spacing w:after="120"/>
+        <w:pageBreakBefore/>
+      </w:pPr>
+      <w:r>
+        <w:t xml:space="preserve">[pageBreakBefore] Paragraf ini meminta halaman baru sebelum dirinya (w:pageBreakBefore).</w:t>
+      </w:r>
+    </w:p>
+    <w:p>
+      <w:pPr>
+        <w:spacing w:after="120"/>
+        <w:keepLines/>
+        <w:widowControl/>
+      </w:pPr>
+      <w:r>
+        <w:t xml:space="preserve">[keepLines + widowControl] Mengurangi janda/yatim: seluruh baris paragraf dijaga, kontrol widow/line orphan aktif.</w:t>
+      </w:r>
+    </w:p>
+    <w:p>
+      <w:pPr>
+        <w:spacing w:after="120"/>
+      </w:pPr>
+      <w:r>
+        <w:t xml:space="preserve">Dalam layout multi-kolom Word, </w:t>
+      </w:r>
+      <w:r>
+        <w:br w:type="column"/>
+      </w:r>
+      <w:r>
+        <w:t xml:space="preserve">teks setelah ini lanjut ke kolom berikutnya.</w:t>
+      </w:r>
+    </w:p>
+    <w:p>
+      <w:r>
+        <w:t xml:space="preserve">(Catatan: AppendPageBreak = w:br w:type page sudah dipakai di atas menuju bagian format run.)</w:t>
+      </w:r>
+    </w:p>
+    <w:p>
+      <w:r>
+        <w:t xml:space="preserve">API section: SetPageNumberStart(&amp;n) + SetPageNumberFormat (decimal, lowerRoman, upperRoman, lowerLetter, …) mengatur w:pgNumType; footer {{PAGE}} mengikuti bagian aktif.</w:t>
+      </w:r>
+    </w:p>
+    <w:p>
+      <w:pPr>
+        <w:spacing w:before="360"/>
+      </w:pPr>
+      <w:r>
+        <w:t xml:space="preserve">Selesai — periksa struktur: sampul + TOC (section pertama), lalu section break next page, lalu isi, pagination OOXML, SetStripLayoutHints untuk save bersih dari lastRenderedPageBreak.</w:t>
       </w:r>
     </w:p>
     <w:sectPr xmlns:w="http://schemas.openxmlformats.org/wordprocessingml/2006/main">
       <w:pgSz w:w="11906" w:h="16838" w:orient="portrait"/>
       <w:pgMar w:top="1800" w:right="1440" w:bottom="1800" w:left="1440" w:header="720" w:footer="720" w:gutter="0"/>
       <w:cols w:num="1" w:sep="0" w:equalWidth="0"/>
+      <w:pgNumType w:start="1" w:fmt="decimal"/>
+      <w:headerReference w:type="default" r:id="rId4"/>
       <w:footerReference w:type="default" r:id="rId3"/>
     </w:sectPr>
   </w:body>
@@ -461,6 +776,34 @@
     </w:r>
   </w:p>
 </w:ftr>
+</file>
+
+<file path=word/header1.xml><?xml version="1.0" encoding="utf-8"?>
+<w:hdr xmlns:w="http://schemas.openxmlformats.org/wordprocessingml/2006/main" xmlns:r="http://schemas.openxmlformats.org/officeDocument/2006/relationships">
+  <w:p>
+    <w:pPr>
+      <w:jc w:val="center"/>
+    </w:pPr>
+    <w:r>
+      <w:t xml:space="preserve">Laporan · p. </w:t>
+    </w:r>
+    <w:r>
+      <w:fldChar w:fldCharType="begin"/>
+    </w:r>
+    <w:r>
+      <w:instrText xml:space="preserve"> PAGE </w:instrText>
+    </w:r>
+    <w:r>
+      <w:fldChar w:fldCharType="separate"/>
+    </w:r>
+    <w:r>
+      <w:t>1</w:t>
+    </w:r>
+    <w:r>
+      <w:fldChar w:fldCharType="end"/>
+    </w:r>
+  </w:p>
+</w:hdr>
 </file>
 
 <file path=word/numbering.xml><?xml version="1.0" encoding="utf-8"?>

</xml_diff>

<commit_message>
Refactor document generation to enhance TOC and style handling
- Removed temporary document files and improved the main.go file to support complex TOC fields in .docx documents.
- Updated the document generation logic to utilize Word's TOC features, including dynamic outline levels and hyperlinks.
- Enhanced paragraph styles to include outline levels for better integration with Word's TOC functionality.
- Introduced new settings for document generation to ensure fields are updated correctly when opened in Word.
- Added tests to validate the new TOC field functionality and ensure proper rendering in generated documents.
</commit_message>
<xml_diff>
--- a/laporan.docx
+++ b/laporan.docx
@@ -104,7 +104,7 @@
         <w:jc w:val="center"/>
       </w:pPr>
       <w:r>
-        <w:t xml:space="preserve">Setelah TOC: SetSectionBreak(nextPage) memisahkan bagian depan dan isi utama.</w:t>
+        <w:t xml:space="preserve">Setelah daftar isi (bidang TOC): SetSectionBreak(nextPage) memisahkan bagian depan dan isi utama.</w:t>
       </w:r>
     </w:p>
     <w:p>
@@ -132,17 +132,56 @@
     </w:p>
     <w:p>
       <w:pPr>
-        <w:spacing w:after="180"/>
-      </w:pPr>
-      <w:r>
-        <w:t xml:space="preserve">Entri manual (titik). TOC otomatis Word = Tier 3.</w:t>
-      </w:r>
-    </w:p>
-    <w:p>
-      <w:pPr>
         <w:spacing w:after="120"/>
       </w:pPr>
       <w:r>
+        <w:t xml:space="preserve">Di bawah: bidang TOC (\o level 1–3, \h, \z). Microsoft Word biasanya memperbarui bidang saat membuka file atau lewat klik kanan → Perbarui bidang. WPS Writer / LibreOffice sering tidak mengevaluasi bidang TOC seperti Word — yang tampak hanya teks placeholder; untuk daftar otomatis penuh buka sekali di Word, atau gunakan ringkasan bab (teks biasa) di bawah.</w:t>
+      </w:r>
+    </w:p>
+    <w:p>
+      <w:pPr>
+        <w:spacing w:after="120"/>
+      </w:pPr>
+      <w:r>
+        <w:fldChar w:fldCharType="begin" w:dirty="true"/>
+      </w:r>
+      <w:r>
+        <w:instrText xml:space="preserve"> TOC \o "1-3" \h \z </w:instrText>
+      </w:r>
+      <w:r>
+        <w:fldChar w:fldCharType="separate"/>
+      </w:r>
+      <w:r>
+        <w:t xml:space="preserve">Klik kanan → Perbarui bidang (Update Field) untuk mengisi daftar isi.</w:t>
+      </w:r>
+      <w:r>
+        <w:fldChar w:fldCharType="end"/>
+      </w:r>
+    </w:p>
+    <w:p>
+      <w:pPr>
+        <w:spacing w:before="120" w:after="60"/>
+      </w:pPr>
+      <w:r>
+        <w:rPr>
+          <w:b/>
+        </w:rPr>
+        <w:t xml:space="preserve">Ringkasan bab (fallback untuk WPS/LibreOffice)</w:t>
+      </w:r>
+    </w:p>
+    <w:p>
+      <w:pPr>
+        <w:spacing w:after="100"/>
+      </w:pPr>
+      <w:r>
+        <w:t xml:space="preserve">Pustaka Go tidak menghitung layout halaman. Nomor di kanan hanya ilustrasi statis (bukan hasil layout). Nomor halaman sejati muncul di bidang TOC setelah dokumen dibuka dan di-layout di Microsoft Word (Perbarui bidang).</w:t>
+      </w:r>
+    </w:p>
+    <w:p>
+      <w:pPr>
+        <w:spacing w:after="60"/>
+      </w:pPr>
+      <w:r>
         <w:rPr>
           <w:sz w:val="22"/>
         </w:rPr>
@@ -151,40 +190,51 @@
     </w:p>
     <w:p>
       <w:pPr>
-        <w:spacing w:after="120"/>
+        <w:spacing w:after="60"/>
       </w:pPr>
       <w:r>
         <w:rPr>
           <w:sz w:val="22"/>
         </w:rPr>
-        <w:t xml:space="preserve">2. Format paragraf &amp; perataan ................................ 3</w:t>
-      </w:r>
-    </w:p>
-    <w:p>
-      <w:pPr>
-        <w:spacing w:after="120"/>
+        <w:t xml:space="preserve">2. Format paragraf ........................................... 3</w:t>
+      </w:r>
+    </w:p>
+    <w:p>
+      <w:pPr>
+        <w:spacing w:after="60"/>
       </w:pPr>
       <w:r>
         <w:rPr>
           <w:sz w:val="22"/>
         </w:rPr>
-        <w:t xml:space="preserve">3. Format run (tebal, warna, …) ............................ 4</w:t>
-      </w:r>
-    </w:p>
-    <w:p>
-      <w:pPr>
-        <w:spacing w:after="120"/>
+        <w:t xml:space="preserve">2.1 Subjudul (Heading2) ...................................... 3</w:t>
+      </w:r>
+    </w:p>
+    <w:p>
+      <w:pPr>
+        <w:spacing w:after="60"/>
       </w:pPr>
       <w:r>
         <w:rPr>
           <w:sz w:val="22"/>
         </w:rPr>
+        <w:t xml:space="preserve">3. Format run ................................................ 4</w:t>
+      </w:r>
+    </w:p>
+    <w:p>
+      <w:pPr>
+        <w:spacing w:after="60"/>
+      </w:pPr>
+      <w:r>
+        <w:rPr>
+          <w:sz w:val="22"/>
+        </w:rPr>
         <w:t xml:space="preserve">4. Daftar .................................................... 4</w:t>
       </w:r>
     </w:p>
     <w:p>
       <w:pPr>
-        <w:spacing w:after="120"/>
+        <w:spacing w:after="60"/>
       </w:pPr>
       <w:r>
         <w:rPr>
@@ -195,7 +245,7 @@
     </w:p>
     <w:p>
       <w:pPr>
-        <w:spacing w:after="120"/>
+        <w:spacing w:after="60"/>
       </w:pPr>
       <w:r>
         <w:rPr>
@@ -221,6 +271,7 @@
     <w:p>
       <w:pPr>
         <w:spacing w:before="120" w:after="200"/>
+        <w:pStyle w:val="Heading1"/>
       </w:pPr>
       <w:r>
         <w:rPr>
@@ -246,6 +297,7 @@
     <w:p>
       <w:pPr>
         <w:spacing w:before="240" w:after="160"/>
+        <w:pStyle w:val="Heading1"/>
       </w:pPr>
       <w:r>
         <w:rPr>
@@ -253,6 +305,18 @@
           <w:sz w:val="28"/>
         </w:rPr>
         <w:t xml:space="preserve">2. Format paragraf</w:t>
+      </w:r>
+    </w:p>
+    <w:p>
+      <w:pPr>
+        <w:spacing w:before="60" w:after="120"/>
+        <w:pStyle w:val="Heading2"/>
+      </w:pPr>
+      <w:r>
+        <w:rPr>
+          <w:b/>
+        </w:rPr>
+        <w:t xml:space="preserve">2.1 Subjudul (Heading2)</w:t>
       </w:r>
     </w:p>
     <w:p>
@@ -307,6 +371,7 @@
     <w:p>
       <w:pPr>
         <w:spacing w:after="160"/>
+        <w:pStyle w:val="Heading1"/>
       </w:pPr>
       <w:r>
         <w:rPr>
@@ -406,6 +471,7 @@
     <w:p>
       <w:pPr>
         <w:spacing w:before="240" w:after="160"/>
+        <w:pStyle w:val="Heading1"/>
       </w:pPr>
       <w:r>
         <w:rPr>
@@ -488,6 +554,7 @@
     <w:p>
       <w:pPr>
         <w:spacing w:before="240" w:after="160"/>
+        <w:pStyle w:val="Heading1"/>
       </w:pPr>
       <w:r>
         <w:rPr>
@@ -635,6 +702,7 @@
     <w:p>
       <w:pPr>
         <w:spacing w:before="240" w:after="160"/>
+        <w:pStyle w:val="Heading1"/>
       </w:pPr>
       <w:r>
         <w:rPr>
@@ -714,7 +782,7 @@
         <w:spacing w:before="360"/>
       </w:pPr>
       <w:r>
-        <w:t xml:space="preserve">Selesai — periksa struktur: sampul + TOC (section pertama), lalu section break next page, lalu isi, pagination OOXML, SetStripLayoutHints untuk save bersih dari lastRenderedPageBreak.</w:t>
+        <w:t xml:space="preserve">Selesai — periksa struktur: sampul + bidang TOC (Perbarui bidang di Word), section break next page, isi dengan Heading1, pagination OOXML, SetStripLayoutHints untuk save bersih dari lastRenderedPageBreak.</w:t>
       </w:r>
     </w:p>
     <w:sectPr xmlns:w="http://schemas.openxmlformats.org/wordprocessingml/2006/main">
@@ -808,6 +876,14 @@
 
 <file path=word/numbering.xml><?xml version="1.0" encoding="utf-8"?>
 <w:numbering xmlns:w="http://schemas.openxmlformats.org/wordprocessingml/2006/main">
+  <w:abstractNum w:abstractNumId="2">
+    <w:lvl w:ilvl="0">
+      <w:start w:val="1"/>
+      <w:numFmt w:val="decimal"/>
+      <w:lvlText w:val="%1."/>
+      <w:lvlJc w:val="left"/>
+    </w:lvl>
+  </w:abstractNum>
   <w:abstractNum w:abstractNumId="1">
     <w:lvl w:ilvl="0">
       <w:start w:val="1"/>
@@ -816,19 +892,11 @@
       <w:lvlJc w:val="left"/>
     </w:lvl>
   </w:abstractNum>
-  <w:abstractNum w:abstractNumId="2">
-    <w:lvl w:ilvl="0">
-      <w:start w:val="1"/>
-      <w:numFmt w:val="decimal"/>
-      <w:lvlText w:val="%1."/>
-      <w:lvlJc w:val="left"/>
-    </w:lvl>
-  </w:abstractNum>
+  <w:num w:numId="2">
+    <w:abstractNumId w:val="2"/>
+  </w:num>
   <w:num w:numId="1">
     <w:abstractNumId w:val="1"/>
-  </w:num>
-  <w:num w:numId="2">
-    <w:abstractNumId w:val="2"/>
   </w:num>
 </w:numbering>
 </file>
@@ -850,14 +918,23 @@
   <w:style w:type="paragraph" w:styleId="Heading1">
     <w:name w:val="heading 1"/>
     <w:basedOn w:val="Normal"/>
+    <w:pPr>
+      <w:outlineLvl w:val="0"/>
+    </w:pPr>
   </w:style>
   <w:style w:type="paragraph" w:styleId="Heading2">
     <w:name w:val="heading 2"/>
     <w:basedOn w:val="Normal"/>
+    <w:pPr>
+      <w:outlineLvl w:val="1"/>
+    </w:pPr>
   </w:style>
   <w:style w:type="paragraph" w:styleId="Heading3">
     <w:name w:val="heading 3"/>
     <w:basedOn w:val="Normal"/>
+    <w:pPr>
+      <w:outlineLvl w:val="2"/>
+    </w:pPr>
   </w:style>
   <w:style w:type="paragraph" w:styleId="ListParagraph">
     <w:name w:val="List Paragraph"/>

</xml_diff>